<commit_message>
docs: revise paper v2.1 and TCSE v2.7 for review feedback
Reviewer-driven wording fixes regenerated through the rewrite
scripts: gloss QLoRA at first occurrence in the abstract, stop
calling unstested score gaps significant, and add limitation (5)
to 6.3 disclosing the missing statistical tests and the un-ablated
RAG injection so the claims match what the 44-sample evaluation
can support.
</commit_message>
<xml_diff>
--- a/paper/TCSE_v2.7.docx
+++ b/paper/TCSE_v2.7.docx
@@ -324,31 +324,31 @@
           <w:rFonts w:eastAsia="標楷體" w:hint="eastAsia" w:ascii="Times New Roman" w:hAnsi="Times New Roman" w:cs="Times New Roman"/>
           <w:sz w:val="20"/>
         </w:rPr>
-        <w:t>）結合量化低</w:t>
+        <w:t>）結合量化低秩適應（Quantized Low-Rank Adaptation, QLoRA）把教師模型</w:t>
       </w:r>
       <w:proofErr w:type="gramStart"/>
       <w:r>
         <w:rPr>
-          <w:rFonts w:eastAsia="標楷體" w:hint="eastAsia" w:ascii="Times New Roman" w:hAnsi="Times New Roman" w:cs="Times New Roman"/>
-          <w:sz w:val="20"/>
-        </w:rPr>
-        <w:t>秩</w:t>
+          <w:rFonts w:eastAsia="標楷體" w:hint="eastAsia"/>
+          <w:sz w:val="20"/>
+        </w:rPr>
+        <w:t/>
       </w:r>
       <w:proofErr w:type="gramEnd"/>
       <w:r>
         <w:rPr>
-          <w:rFonts w:eastAsia="標楷體" w:hint="eastAsia" w:ascii="Times New Roman" w:hAnsi="Times New Roman" w:cs="Times New Roman"/>
-          <w:sz w:val="20"/>
-        </w:rPr>
-        <w:t>適應（</w:t>
+          <w:rFonts w:eastAsia="標楷體" w:hint="eastAsia"/>
+          <w:sz w:val="20"/>
+        </w:rPr>
+        <w:t/>
       </w:r>
       <w:proofErr w:type="spellStart"/>
       <w:r>
         <w:rPr>
-          <w:rFonts w:eastAsia="標楷體" w:hint="eastAsia" w:ascii="Times New Roman" w:hAnsi="Times New Roman" w:cs="Times New Roman"/>
-          <w:sz w:val="20"/>
-        </w:rPr>
-        <w:t>QLoRA</w:t>
+          <w:rFonts w:eastAsia="標楷體" w:hint="eastAsia"/>
+          <w:sz w:val="20"/>
+        </w:rPr>
+        <w:t/>
       </w:r>
       <w:proofErr w:type="spellEnd"/>
       <w:r>
@@ -356,7 +356,7 @@
           <w:rFonts w:eastAsia="標楷體" w:hint="eastAsia" w:ascii="Times New Roman" w:hAnsi="Times New Roman" w:cs="Times New Roman"/>
           <w:sz w:val="20"/>
         </w:rPr>
-        <w:t>）把教師模型之審查能力轉移至可於有限資源部署之輕量學生模型（對應可落地之可維護性）。於</w:t>
+        <w:t>之審查能力轉移至可於有限資源部署之輕量學生模型（對應可落地之可維護性）。於</w:t>
       </w:r>
       <w:r>
         <w:rPr>
@@ -1034,22 +1034,22 @@
           <w:rFonts w:eastAsia="標楷體" w:hint="eastAsia" w:ascii="Times New Roman" w:hAnsi="Times New Roman" w:cs="Times New Roman"/>
           <w:sz w:val="20"/>
         </w:rPr>
-        <w:t>問題，本研究的構想是：與其分別修補幻覺、不穩定與缺領域規範，不如把彼此互補的三項技術整合成一套框架，讓它們各自負責一個問題又能協同運作。框架以多階段分析將審查拆解為摘要生成、初步審查、靜態分析、程式碼異味偵測與總結報告等循序步驟（思維鏈</w:t>
-      </w:r>
-      <w:r>
-        <w:rPr>
-          <w:rFonts w:eastAsia="標楷體" w:hint="eastAsia"/>
-          <w:sz w:val="20"/>
-        </w:rPr>
-        <w:t xml:space="preserve"> </w:t>
+        <w:t>問題，本研究的構想是：與其分別修補幻覺、不穩定與缺領域規範，不如把彼此互補的三項技術整合成一套框架，讓它們各自負責一個問題又能協同運作。框架以多階段分析將審查拆解為摘要生成、初步審查、靜態分析、程式碼異味偵測與總結報告等循序步驟（思維鏈 CoT 係一種</w:t>
+      </w:r>
+      <w:r>
+        <w:rPr>
+          <w:rFonts w:eastAsia="標楷體" w:hint="eastAsia"/>
+          <w:sz w:val="20"/>
+        </w:rPr>
+        <w:t xml:space="preserve"/>
       </w:r>
       <w:proofErr w:type="spellStart"/>
       <w:r>
         <w:rPr>
-          <w:rFonts w:eastAsia="標楷體" w:hint="eastAsia" w:ascii="Times New Roman" w:hAnsi="Times New Roman" w:cs="Times New Roman"/>
-          <w:sz w:val="20"/>
-        </w:rPr>
-        <w:t>CoT</w:t>
+          <w:rFonts w:eastAsia="標楷體" w:hint="eastAsia"/>
+          <w:sz w:val="20"/>
+        </w:rPr>
+        <w:t/>
       </w:r>
       <w:proofErr w:type="spellEnd"/>
       <w:r>
@@ -1057,7 +1057,7 @@
           <w:rFonts w:eastAsia="標楷體" w:hint="eastAsia" w:ascii="Times New Roman" w:hAnsi="Times New Roman" w:cs="Times New Roman"/>
           <w:sz w:val="20"/>
         </w:rPr>
-        <w:t>係一種引導模型先逐步推理、再給出結論之提示策略，可提升模型於複雜任務上之推理品質），使</w:t>
+        <w:t>引導模型先逐步推理、再給出結論之提示策略，可提升模型於複雜任務上之推理品質），使</w:t>
       </w:r>
       <w:proofErr w:type="gramStart"/>
       <w:r>
@@ -1103,38 +1103,38 @@
           <w:rFonts w:eastAsia="標楷體" w:hint="eastAsia" w:ascii="Times New Roman" w:hAnsi="Times New Roman" w:cs="Times New Roman"/>
           <w:sz w:val="20"/>
         </w:rPr>
-        <w:t>則將專案規範與領域知識在推理前注入脈絡，於不重新訓練模型之前提下抑制幻覺，以換取可解釋性。模型面</w:t>
+        <w:t>則將專案規範與領域知識在推理前注入脈絡，於不重新訓練模型之前提下抑制幻覺，以換取可解釋性。模型面採知識蒸餾結合量化低秩適應（Quantized Low-Rank Adaptation, QLoRA），將教師模型</w:t>
       </w:r>
       <w:proofErr w:type="gramStart"/>
       <w:r>
         <w:rPr>
-          <w:rFonts w:eastAsia="標楷體" w:hint="eastAsia" w:ascii="Times New Roman" w:hAnsi="Times New Roman" w:cs="Times New Roman"/>
-          <w:sz w:val="20"/>
-        </w:rPr>
-        <w:t>採</w:t>
+          <w:rFonts w:eastAsia="標楷體" w:hint="eastAsia"/>
+          <w:sz w:val="20"/>
+        </w:rPr>
+        <w:t/>
       </w:r>
       <w:proofErr w:type="gramEnd"/>
       <w:r>
         <w:rPr>
-          <w:rFonts w:eastAsia="標楷體" w:hint="eastAsia" w:ascii="Times New Roman" w:hAnsi="Times New Roman" w:cs="Times New Roman"/>
-          <w:sz w:val="20"/>
-        </w:rPr>
-        <w:t>知識蒸餾結合</w:t>
-      </w:r>
-      <w:r>
-        <w:rPr>
-          <w:rFonts w:eastAsia="標楷體" w:hint="eastAsia"/>
-          <w:sz w:val="20"/>
-        </w:rPr>
-        <w:t xml:space="preserve"> </w:t>
+          <w:rFonts w:eastAsia="標楷體" w:hint="eastAsia"/>
+          <w:sz w:val="20"/>
+        </w:rPr>
+        <w:t/>
+      </w:r>
+      <w:r>
+        <w:rPr>
+          <w:rFonts w:eastAsia="標楷體" w:hint="eastAsia"/>
+          <w:sz w:val="20"/>
+        </w:rPr>
+        <w:t xml:space="preserve"/>
       </w:r>
       <w:proofErr w:type="spellStart"/>
       <w:r>
         <w:rPr>
-          <w:rFonts w:eastAsia="標楷體" w:hint="eastAsia" w:ascii="Times New Roman" w:hAnsi="Times New Roman" w:cs="Times New Roman"/>
-          <w:sz w:val="20"/>
-        </w:rPr>
-        <w:t>QLoRA</w:t>
+          <w:rFonts w:eastAsia="標楷體" w:hint="eastAsia"/>
+          <w:sz w:val="20"/>
+        </w:rPr>
+        <w:t/>
       </w:r>
       <w:proofErr w:type="spellEnd"/>
       <w:r>
@@ -1142,7 +1142,7 @@
           <w:rFonts w:eastAsia="標楷體" w:hint="eastAsia" w:ascii="Times New Roman" w:hAnsi="Times New Roman" w:cs="Times New Roman"/>
           <w:sz w:val="20"/>
         </w:rPr>
-        <w:t>，將教師模型之高階推理能力</w:t>
+        <w:t>之高階推理能力</w:t>
       </w:r>
       <w:proofErr w:type="gramStart"/>
       <w:r>
@@ -2717,21 +2717,21 @@
           <w:rFonts w:eastAsia="標楷體" w:hint="eastAsia" w:ascii="Times New Roman" w:hAnsi="Times New Roman" w:cs="Times New Roman"/>
           <w:sz w:val="20"/>
         </w:rPr>
-        <w:t>，使大型語言模型於審查過程中得參考領域知識並逐步推理。如圖一</w:t>
-      </w:r>
-      <w:r>
-        <w:rPr>
-          <w:rFonts w:eastAsia="標楷體" w:hint="eastAsia"/>
-          <w:sz w:val="20"/>
-        </w:rPr>
-        <w:t xml:space="preserve"> </w:t>
-      </w:r>
-      <w:r>
-        <w:rPr>
-          <w:rFonts w:eastAsia="標楷體" w:hint="eastAsia" w:ascii="Times New Roman" w:hAnsi="Times New Roman" w:cs="Times New Roman"/>
-          <w:sz w:val="20"/>
-        </w:rPr>
-        <w:t>所示，系統整體架構依職責劃分為輸入、流程編排、檢索增強、提示模板、離線訓練與推論六層，各層以明確介面相互溝通並由對應之軟體設計模式約束實作邊界，便於替換審查步驟、提示模板、檢索器或基座模型而不牽動</w:t>
+        <w:t>，使大型語言模型於審查過程中得參考領域知識並逐步推理。如圖一所示</w:t>
+      </w:r>
+      <w:r>
+        <w:rPr>
+          <w:rFonts w:eastAsia="標楷體" w:hint="eastAsia"/>
+          <w:sz w:val="20"/>
+        </w:rPr>
+        <w:t xml:space="preserve"/>
+      </w:r>
+      <w:r>
+        <w:rPr>
+          <w:rFonts w:eastAsia="標楷體" w:hint="eastAsia" w:ascii="Times New Roman" w:hAnsi="Times New Roman" w:cs="Times New Roman"/>
+          <w:sz w:val="20"/>
+        </w:rPr>
+        <w:t>，系統整體架構依職責劃分為輸入、流程編排、檢索增強、提示模板、離線訓練與推論六層，各層以明確介面相互溝通並由對應之軟體設計模式約束實作邊界，便於替換審查步驟、提示模板、檢索器或基座模型而不牽動</w:t>
       </w:r>
       <w:proofErr w:type="gramStart"/>
       <w:r>
@@ -3394,21 +3394,21 @@
           <w:rFonts w:eastAsia="標楷體" w:hint="eastAsia" w:ascii="Times New Roman" w:hAnsi="Times New Roman" w:cs="Times New Roman"/>
           <w:sz w:val="20"/>
         </w:rPr>
-        <w:t>微調流程（如圖二</w:t>
-      </w:r>
-      <w:r>
-        <w:rPr>
-          <w:rFonts w:eastAsia="標楷體" w:hint="eastAsia"/>
-          <w:sz w:val="20"/>
-        </w:rPr>
-        <w:t xml:space="preserve"> </w:t>
-      </w:r>
-      <w:r>
-        <w:rPr>
-          <w:rFonts w:eastAsia="標楷體" w:hint="eastAsia" w:ascii="Times New Roman" w:hAnsi="Times New Roman" w:cs="Times New Roman"/>
-          <w:sz w:val="20"/>
-        </w:rPr>
-        <w:t>所示），於有限運算資源</w:t>
+        <w:t>微調流程（如圖二所示</w:t>
+      </w:r>
+      <w:r>
+        <w:rPr>
+          <w:rFonts w:eastAsia="標楷體" w:hint="eastAsia"/>
+          <w:sz w:val="20"/>
+        </w:rPr>
+        <w:t xml:space="preserve"/>
+      </w:r>
+      <w:r>
+        <w:rPr>
+          <w:rFonts w:eastAsia="標楷體" w:hint="eastAsia" w:ascii="Times New Roman" w:hAnsi="Times New Roman" w:cs="Times New Roman"/>
+          <w:sz w:val="20"/>
+        </w:rPr>
+        <w:t>），於有限運算資源</w:t>
       </w:r>
       <w:proofErr w:type="gramStart"/>
       <w:r>
@@ -4506,21 +4506,21 @@
           <w:rFonts w:eastAsia="標楷體" w:hint="eastAsia" w:ascii="Times New Roman" w:hAnsi="Times New Roman" w:cs="Times New Roman"/>
           <w:sz w:val="20"/>
         </w:rPr>
-        <w:t>架構（如圖三</w:t>
-      </w:r>
-      <w:r>
-        <w:rPr>
-          <w:rFonts w:eastAsia="標楷體" w:hint="eastAsia"/>
-          <w:sz w:val="20"/>
-        </w:rPr>
-        <w:t xml:space="preserve"> </w:t>
-      </w:r>
-      <w:r>
-        <w:rPr>
-          <w:rFonts w:eastAsia="標楷體" w:hint="eastAsia" w:ascii="Times New Roman" w:hAnsi="Times New Roman" w:cs="Times New Roman"/>
-          <w:sz w:val="20"/>
-        </w:rPr>
-        <w:t>所示），即請一個不參與審查的第三方模型依固定標準替每份審查報告打分，以省去大量人工標</w:t>
+        <w:t>架構（如圖三所示</w:t>
+      </w:r>
+      <w:r>
+        <w:rPr>
+          <w:rFonts w:eastAsia="標楷體" w:hint="eastAsia"/>
+          <w:sz w:val="20"/>
+        </w:rPr>
+        <w:t xml:space="preserve"/>
+      </w:r>
+      <w:r>
+        <w:rPr>
+          <w:rFonts w:eastAsia="標楷體" w:hint="eastAsia" w:ascii="Times New Roman" w:hAnsi="Times New Roman" w:cs="Times New Roman"/>
+          <w:sz w:val="20"/>
+        </w:rPr>
+        <w:t>），即請一個不參與審查的第三方模型依固定標準替每份審查報告打分，以省去大量人工標</w:t>
       </w:r>
       <w:proofErr w:type="gramStart"/>
       <w:r>
@@ -5074,7 +5074,49 @@
           <w:rFonts w:eastAsia="標楷體" w:hint="eastAsia" w:ascii="Times New Roman" w:hAnsi="Times New Roman" w:cs="Times New Roman"/>
           <w:sz w:val="20"/>
         </w:rPr>
-        <w:t>清四個研究問題與實驗結果之對應關係：表一</w:t>
+        <w:t>清四個研究問題與實驗結果之對應關係：表一以</w:t>
+      </w:r>
+      <w:r>
+        <w:rPr>
+          <w:rFonts w:eastAsia="標楷體" w:hint="eastAsia"/>
+          <w:sz w:val="20"/>
+        </w:rPr>
+        <w:t xml:space="preserve"/>
+      </w:r>
+      <w:r>
+        <w:rPr>
+          <w:rFonts w:eastAsia="標楷體" w:hint="eastAsia"/>
+          <w:sz w:val="20"/>
+        </w:rPr>
+        <w:t/>
+      </w:r>
+      <w:r>
+        <w:rPr>
+          <w:rFonts w:eastAsia="標楷體" w:hint="eastAsia" w:ascii="Times New Roman" w:hAnsi="Times New Roman" w:cs="Times New Roman"/>
+          <w:sz w:val="20"/>
+        </w:rPr>
+        <w:t xml:space="preserve"> CRSCORE++ </w:t>
+      </w:r>
+      <w:r>
+        <w:rPr>
+          <w:rFonts w:eastAsia="標楷體" w:hint="eastAsia" w:ascii="Times New Roman" w:hAnsi="Times New Roman" w:cs="Times New Roman"/>
+          <w:sz w:val="20"/>
+        </w:rPr>
+        <w:t>之三項自動化指標回答</w:t>
+      </w:r>
+      <w:r>
+        <w:rPr>
+          <w:rFonts w:eastAsia="標楷體" w:hint="eastAsia" w:ascii="Times New Roman" w:hAnsi="Times New Roman" w:cs="Times New Roman"/>
+          <w:sz w:val="20"/>
+        </w:rPr>
+        <w:t xml:space="preserve"> RQ1</w:t>
+      </w:r>
+      <w:r>
+        <w:rPr>
+          <w:rFonts w:eastAsia="標楷體" w:hint="eastAsia" w:ascii="Times New Roman" w:hAnsi="Times New Roman" w:cs="Times New Roman"/>
+          <w:sz w:val="20"/>
+        </w:rPr>
+        <w:t>（完整框架之多階段提示詞加</w:t>
       </w:r>
       <w:r>
         <w:rPr>
@@ -5083,41 +5125,15 @@
         </w:rPr>
         <w:t xml:space="preserve"> </w:t>
       </w:r>
-      <w:r>
-        <w:rPr>
-          <w:rFonts w:eastAsia="標楷體" w:hint="eastAsia" w:ascii="Times New Roman" w:hAnsi="Times New Roman" w:cs="Times New Roman"/>
-          <w:sz w:val="20"/>
-        </w:rPr>
-        <w:t>以</w:t>
-      </w:r>
-      <w:r>
-        <w:rPr>
-          <w:rFonts w:eastAsia="標楷體" w:hint="eastAsia" w:ascii="Times New Roman" w:hAnsi="Times New Roman" w:cs="Times New Roman"/>
-          <w:sz w:val="20"/>
-        </w:rPr>
-        <w:t xml:space="preserve"> CRSCORE++ </w:t>
-      </w:r>
-      <w:r>
-        <w:rPr>
-          <w:rFonts w:eastAsia="標楷體" w:hint="eastAsia" w:ascii="Times New Roman" w:hAnsi="Times New Roman" w:cs="Times New Roman"/>
-          <w:sz w:val="20"/>
-        </w:rPr>
-        <w:t>之三項自動化指標回答</w:t>
-      </w:r>
-      <w:r>
-        <w:rPr>
-          <w:rFonts w:eastAsia="標楷體" w:hint="eastAsia" w:ascii="Times New Roman" w:hAnsi="Times New Roman" w:cs="Times New Roman"/>
-          <w:sz w:val="20"/>
-        </w:rPr>
-        <w:t xml:space="preserve"> RQ1</w:t>
-      </w:r>
-      <w:r>
-        <w:rPr>
-          <w:rFonts w:eastAsia="標楷體" w:hint="eastAsia" w:ascii="Times New Roman" w:hAnsi="Times New Roman" w:cs="Times New Roman"/>
-          <w:sz w:val="20"/>
-        </w:rPr>
-        <w:t>（完整框架之多階段提示詞加</w:t>
-      </w:r>
+      <w:proofErr w:type="spellStart"/>
+      <w:r>
+        <w:rPr>
+          <w:rFonts w:eastAsia="標楷體" w:hint="eastAsia" w:ascii="Times New Roman" w:hAnsi="Times New Roman" w:cs="Times New Roman"/>
+          <w:sz w:val="20"/>
+        </w:rPr>
+        <w:t>LoRA</w:t>
+      </w:r>
+      <w:proofErr w:type="spellEnd"/>
       <w:r>
         <w:rPr>
           <w:rFonts w:eastAsia="標楷體" w:hint="eastAsia"/>
@@ -5125,22 +5141,6 @@
         </w:rPr>
         <w:t xml:space="preserve"> </w:t>
       </w:r>
-      <w:proofErr w:type="spellStart"/>
-      <w:r>
-        <w:rPr>
-          <w:rFonts w:eastAsia="標楷體" w:hint="eastAsia" w:ascii="Times New Roman" w:hAnsi="Times New Roman" w:cs="Times New Roman"/>
-          <w:sz w:val="20"/>
-        </w:rPr>
-        <w:t>LoRA</w:t>
-      </w:r>
-      <w:proofErr w:type="spellEnd"/>
-      <w:r>
-        <w:rPr>
-          <w:rFonts w:eastAsia="標楷體" w:hint="eastAsia"/>
-          <w:sz w:val="20"/>
-        </w:rPr>
-        <w:t xml:space="preserve"> </w:t>
-      </w:r>
       <w:r>
         <w:rPr>
           <w:rFonts w:eastAsia="標楷體" w:hint="eastAsia" w:ascii="Times New Roman" w:hAnsi="Times New Roman" w:cs="Times New Roman"/>
@@ -5174,21 +5174,21 @@
           <w:rFonts w:eastAsia="標楷體" w:hint="eastAsia" w:ascii="Times New Roman" w:hAnsi="Times New Roman" w:cs="Times New Roman"/>
           <w:sz w:val="20"/>
         </w:rPr>
-        <w:t>（相同參數規模、僅多階段提示詞之效益），藉此排除模型容量差異後分離出提示詞之單獨貢獻。表二</w:t>
-      </w:r>
-      <w:r>
-        <w:rPr>
-          <w:rFonts w:eastAsia="標楷體" w:hint="eastAsia"/>
-          <w:sz w:val="20"/>
-        </w:rPr>
-        <w:t xml:space="preserve"> </w:t>
-      </w:r>
-      <w:r>
-        <w:rPr>
-          <w:rFonts w:eastAsia="標楷體" w:hint="eastAsia" w:ascii="Times New Roman" w:hAnsi="Times New Roman" w:cs="Times New Roman"/>
-          <w:sz w:val="20"/>
-        </w:rPr>
-        <w:t>拆解完整方法、微調加單一提示詞、未微調加多階段提示詞三種設定，兩兩之差距分別量化提示詞與微調之邊際貢獻以對應</w:t>
+        <w:t>（相同參數規模、僅多階段提示詞之效益），藉此排除模型容量差異後分離出提示詞之單獨貢獻。表二拆解</w:t>
+      </w:r>
+      <w:r>
+        <w:rPr>
+          <w:rFonts w:eastAsia="標楷體" w:hint="eastAsia"/>
+          <w:sz w:val="20"/>
+        </w:rPr>
+        <w:t xml:space="preserve"/>
+      </w:r>
+      <w:r>
+        <w:rPr>
+          <w:rFonts w:eastAsia="標楷體" w:hint="eastAsia" w:ascii="Times New Roman" w:hAnsi="Times New Roman" w:cs="Times New Roman"/>
+          <w:sz w:val="20"/>
+        </w:rPr>
+        <w:t>完整方法、微調加單一提示詞、未微調加多階段提示詞三種設定，兩兩之差距分別量化提示詞與微調之邊際貢獻以對應</w:t>
       </w:r>
       <w:r>
         <w:rPr>
@@ -5202,21 +5202,21 @@
           <w:rFonts w:eastAsia="標楷體" w:hint="eastAsia" w:ascii="Times New Roman" w:hAnsi="Times New Roman" w:cs="Times New Roman"/>
           <w:sz w:val="20"/>
         </w:rPr>
-        <w:t>。表三</w:t>
-      </w:r>
-      <w:r>
-        <w:rPr>
-          <w:rFonts w:eastAsia="標楷體" w:hint="eastAsia"/>
-          <w:sz w:val="20"/>
-        </w:rPr>
-        <w:t xml:space="preserve"> </w:t>
-      </w:r>
-      <w:r>
-        <w:rPr>
-          <w:rFonts w:eastAsia="標楷體" w:hint="eastAsia" w:ascii="Times New Roman" w:hAnsi="Times New Roman" w:cs="Times New Roman"/>
-          <w:sz w:val="20"/>
-        </w:rPr>
-        <w:t>則為相同三組設定之人工評分，作為對</w:t>
+        <w:t>。表三則為</w:t>
+      </w:r>
+      <w:r>
+        <w:rPr>
+          <w:rFonts w:eastAsia="標楷體" w:hint="eastAsia"/>
+          <w:sz w:val="20"/>
+        </w:rPr>
+        <w:t xml:space="preserve"/>
+      </w:r>
+      <w:r>
+        <w:rPr>
+          <w:rFonts w:eastAsia="標楷體" w:hint="eastAsia" w:ascii="Times New Roman" w:hAnsi="Times New Roman" w:cs="Times New Roman"/>
+          <w:sz w:val="20"/>
+        </w:rPr>
+        <w:t>相同三組設定之人工評分，作為對</w:t>
       </w:r>
       <w:r>
         <w:rPr>
@@ -5960,15 +5960,15 @@
           <w:sz w:val="20"/>
         </w:rPr>
         <w:lastRenderedPageBreak/>
-        <w:t xml:space="preserve">5.2 </w:t>
-      </w:r>
-      <w:r>
-        <w:rPr>
-          <w:rFonts w:eastAsia="標楷體" w:hint="eastAsia" w:ascii="Times New Roman" w:hAnsi="Times New Roman" w:cs="Times New Roman"/>
+        <w:t xml:space="preserve">5.2 RQ1：整體品質與既有基準之比較</w:t>
+      </w:r>
+      <w:r>
+        <w:rPr>
+          <w:rFonts w:eastAsia="標楷體" w:hint="eastAsia"/>
           <w:b/>
           <w:sz w:val="20"/>
         </w:rPr>
-        <w:t>自動化評估結果</w:t>
+        <w:t/>
       </w:r>
     </w:p>
     <w:p>
@@ -5984,14 +5984,14 @@
           <w:rFonts w:eastAsia="標楷體" w:hint="eastAsia" w:ascii="Times New Roman" w:hAnsi="Times New Roman" w:cs="Times New Roman"/>
           <w:sz w:val="20"/>
         </w:rPr>
-        <w:t>RQ1</w:t>
-      </w:r>
-      <w:r>
-        <w:rPr>
-          <w:rFonts w:eastAsia="標楷體" w:hint="eastAsia" w:ascii="Times New Roman" w:hAnsi="Times New Roman" w:cs="Times New Roman"/>
-          <w:sz w:val="20"/>
-        </w:rPr>
-        <w:t>：所提出之整合框架相較</w:t>
+        <w:t>所提出之整合框架</w:t>
+      </w:r>
+      <w:r>
+        <w:rPr>
+          <w:rFonts w:eastAsia="標楷體" w:hint="eastAsia" w:ascii="Times New Roman" w:hAnsi="Times New Roman" w:cs="Times New Roman"/>
+          <w:sz w:val="20"/>
+        </w:rPr>
+        <w:t>相較</w:t>
       </w:r>
       <w:r>
         <w:rPr>
@@ -6089,7 +6089,7 @@
           <w:rFonts w:eastAsia="標楷體" w:hint="eastAsia" w:ascii="Times New Roman" w:hAnsi="Times New Roman" w:cs="Times New Roman"/>
           <w:sz w:val="20"/>
         </w:rPr>
-        <w:t>）三個面向皆顯著提升（表一，三項皆介於 0 至 1，越接近 1 越好）</w:t>
+        <w:t>）三個面向皆明顯提升（表一，三項皆介於 0 至 1，越接近 1 越好）</w:t>
       </w:r>
       <w:r>
         <w:rPr>
@@ -6194,132 +6194,174 @@
     </w:p>
     <w:p>
       <w:pPr>
-        <w:jc w:val="both"/>
-        <w:rPr>
-          <w:rFonts w:eastAsia="標楷體"/>
-          <w:sz w:val="20"/>
-        </w:rPr>
-      </w:pPr>
-      <w:r>
-        <w:rPr>
-          <w:rFonts w:eastAsia="標楷體" w:hint="eastAsia" w:ascii="Times New Roman" w:hAnsi="Times New Roman" w:cs="Times New Roman"/>
-          <w:sz w:val="20"/>
-        </w:rPr>
-        <w:t>RQ2</w:t>
-      </w:r>
-      <w:r>
-        <w:rPr>
-          <w:rFonts w:eastAsia="標楷體" w:hint="eastAsia" w:ascii="Times New Roman" w:hAnsi="Times New Roman" w:cs="Times New Roman"/>
-          <w:sz w:val="20"/>
-        </w:rPr>
-        <w:t>：於相同參數量之未微調模型上套用多階段提示詞，其</w:t>
-      </w:r>
-      <w:r>
-        <w:rPr>
-          <w:rFonts w:eastAsia="標楷體" w:hint="eastAsia" w:ascii="Times New Roman" w:hAnsi="Times New Roman" w:cs="Times New Roman"/>
-          <w:sz w:val="20"/>
-        </w:rPr>
-        <w:t xml:space="preserve"> comprehensiveness </w:t>
-      </w:r>
-      <w:r>
-        <w:rPr>
-          <w:rFonts w:eastAsia="標楷體" w:hint="eastAsia" w:ascii="Times New Roman" w:hAnsi="Times New Roman" w:cs="Times New Roman"/>
-          <w:sz w:val="20"/>
-        </w:rPr>
-        <w:t>與</w:t>
-      </w:r>
-      <w:r>
-        <w:rPr>
-          <w:rFonts w:eastAsia="標楷體" w:hint="eastAsia" w:ascii="Times New Roman" w:hAnsi="Times New Roman" w:cs="Times New Roman"/>
-          <w:sz w:val="20"/>
-        </w:rPr>
-        <w:t xml:space="preserve"> relevance </w:t>
-      </w:r>
-      <w:r>
-        <w:rPr>
-          <w:rFonts w:eastAsia="標楷體" w:hint="eastAsia" w:ascii="Times New Roman" w:hAnsi="Times New Roman" w:cs="Times New Roman"/>
-          <w:sz w:val="20"/>
-        </w:rPr>
-        <w:t>仍明顯優於</w:t>
-      </w:r>
-      <w:r>
-        <w:rPr>
-          <w:rFonts w:eastAsia="標楷體" w:hint="eastAsia" w:ascii="Times New Roman" w:hAnsi="Times New Roman" w:cs="Times New Roman"/>
-          <w:sz w:val="20"/>
-        </w:rPr>
-        <w:t xml:space="preserve"> CRSCORE++</w:t>
-      </w:r>
-      <w:r>
-        <w:rPr>
-          <w:rFonts w:eastAsia="標楷體" w:hint="eastAsia" w:ascii="Times New Roman" w:hAnsi="Times New Roman" w:cs="Times New Roman"/>
-          <w:sz w:val="20"/>
-        </w:rPr>
-        <w:t>，僅 conciseness 略遜（表一），顯示即使未經微調</w:t>
-      </w:r>
-      <w:r>
-        <w:rPr>
-          <w:rFonts w:eastAsia="標楷體" w:hint="eastAsia"/>
-          <w:sz w:val="20"/>
-        </w:rPr>
-        <w:t xml:space="preserve"/>
-      </w:r>
-      <w:r>
-        <w:rPr>
-          <w:rFonts w:eastAsia="標楷體" w:hint="eastAsia" w:ascii="Times New Roman" w:hAnsi="Times New Roman" w:cs="Times New Roman"/>
-          <w:sz w:val="20"/>
-        </w:rPr>
-        <w:t>、在同等模型容量下，光是把審查流程結構化為多階段本身就能帶來實質之品質效益，可見多階段流程是整合框架中舉足輕重的一環，但如下節所示，它與微調、</w:t>
-      </w:r>
-      <w:r>
-        <w:rPr>
-          <w:rFonts w:eastAsia="標楷體" w:hint="eastAsia" w:ascii="Times New Roman" w:hAnsi="Times New Roman" w:cs="Times New Roman"/>
-          <w:sz w:val="20"/>
-        </w:rPr>
-        <w:t xml:space="preserve">RAG </w:t>
-      </w:r>
-      <w:r>
-        <w:rPr>
-          <w:rFonts w:eastAsia="標楷體" w:hint="eastAsia" w:ascii="Times New Roman" w:hAnsi="Times New Roman" w:cs="Times New Roman"/>
-          <w:sz w:val="20"/>
-        </w:rPr>
-        <w:t>解決的是不同問題而仍需三者協同。</w:t>
+        <w:spacing w:before="120" w:after="60"/>
+      </w:pPr>
+      <w:r>
+        <w:rPr>
+          <w:rFonts w:eastAsia="標楷體" w:hint="eastAsia" w:ascii="Times New Roman" w:hAnsi="Times New Roman" w:cs="Times New Roman"/>
+          <w:b/>
+          <w:sz w:val="20"/>
+        </w:rPr>
+        <w:t xml:space="preserve">5.3 </w:t>
+      </w:r>
+      <w:r>
+        <w:rPr>
+          <w:rFonts w:eastAsia="標楷體" w:hint="eastAsia" w:ascii="Times New Roman" w:hAnsi="Times New Roman" w:cs="Times New Roman"/>
+          <w:b/>
+          <w:sz w:val="20"/>
+        </w:rPr>
+        <w:t>RQ2：多階段提示詞之單獨效益</w:t>
       </w:r>
     </w:p>
     <w:p>
       <w:pPr>
         <w:jc w:val="both"/>
         <w:rPr>
-          <w:rFonts w:eastAsia="標楷體" w:hint="eastAsia"/>
-          <w:sz w:val="20"/>
-        </w:rPr>
-      </w:pPr>
-      <w:r>
-        <w:rPr>
-          <w:rFonts w:eastAsia="標楷體" w:hint="eastAsia" w:ascii="Times New Roman" w:hAnsi="Times New Roman" w:cs="Times New Roman"/>
-          <w:sz w:val="20"/>
-        </w:rPr>
-        <w:t>RQ3</w:t>
-      </w:r>
-      <w:r>
-        <w:rPr>
-          <w:rFonts w:eastAsia="標楷體" w:hint="eastAsia" w:ascii="Times New Roman" w:hAnsi="Times New Roman" w:cs="Times New Roman"/>
-          <w:sz w:val="20"/>
-        </w:rPr>
-        <w:t>：由表二</w:t>
-      </w:r>
-      <w:r>
-        <w:rPr>
-          <w:rFonts w:eastAsia="標楷體" w:hint="eastAsia"/>
-          <w:sz w:val="20"/>
-        </w:rPr>
-        <w:t xml:space="preserve"> </w:t>
-      </w:r>
-      <w:r>
-        <w:rPr>
-          <w:rFonts w:eastAsia="標楷體" w:hint="eastAsia" w:ascii="Times New Roman" w:hAnsi="Times New Roman" w:cs="Times New Roman"/>
-          <w:sz w:val="20"/>
-        </w:rPr>
-        <w:t>之消融結果可將整合框架之成效分解為各元件之貢獻：自單一</w:t>
+          <w:rFonts w:eastAsia="標楷體"/>
+          <w:sz w:val="20"/>
+        </w:rPr>
+      </w:pPr>
+      <w:r>
+        <w:rPr>
+          <w:rFonts w:eastAsia="標楷體" w:hint="eastAsia" w:ascii="Times New Roman" w:hAnsi="Times New Roman" w:cs="Times New Roman"/>
+          <w:sz w:val="20"/>
+        </w:rPr>
+        <w:t>於相同參數量</w:t>
+      </w:r>
+      <w:r>
+        <w:rPr>
+          <w:rFonts w:eastAsia="標楷體" w:hint="eastAsia" w:ascii="Times New Roman" w:hAnsi="Times New Roman" w:cs="Times New Roman"/>
+          <w:sz w:val="20"/>
+        </w:rPr>
+        <w:t>之未微調模型上套用多階段提示詞，其</w:t>
+      </w:r>
+      <w:r>
+        <w:rPr>
+          <w:rFonts w:eastAsia="標楷體" w:hint="eastAsia" w:ascii="Times New Roman" w:hAnsi="Times New Roman" w:cs="Times New Roman"/>
+          <w:sz w:val="20"/>
+        </w:rPr>
+        <w:t xml:space="preserve"> comprehensiveness </w:t>
+      </w:r>
+      <w:r>
+        <w:rPr>
+          <w:rFonts w:eastAsia="標楷體" w:hint="eastAsia" w:ascii="Times New Roman" w:hAnsi="Times New Roman" w:cs="Times New Roman"/>
+          <w:sz w:val="20"/>
+        </w:rPr>
+        <w:t>與</w:t>
+      </w:r>
+      <w:r>
+        <w:rPr>
+          <w:rFonts w:eastAsia="標楷體" w:hint="eastAsia" w:ascii="Times New Roman" w:hAnsi="Times New Roman" w:cs="Times New Roman"/>
+          <w:sz w:val="20"/>
+        </w:rPr>
+        <w:t xml:space="preserve"> relevance </w:t>
+      </w:r>
+      <w:r>
+        <w:rPr>
+          <w:rFonts w:eastAsia="標楷體" w:hint="eastAsia" w:ascii="Times New Roman" w:hAnsi="Times New Roman" w:cs="Times New Roman"/>
+          <w:sz w:val="20"/>
+        </w:rPr>
+        <w:t>仍明顯優於</w:t>
+      </w:r>
+      <w:r>
+        <w:rPr>
+          <w:rFonts w:eastAsia="標楷體" w:hint="eastAsia" w:ascii="Times New Roman" w:hAnsi="Times New Roman" w:cs="Times New Roman"/>
+          <w:sz w:val="20"/>
+        </w:rPr>
+        <w:t xml:space="preserve"> CRSCORE++</w:t>
+      </w:r>
+      <w:r>
+        <w:rPr>
+          <w:rFonts w:eastAsia="標楷體" w:hint="eastAsia" w:ascii="Times New Roman" w:hAnsi="Times New Roman" w:cs="Times New Roman"/>
+          <w:sz w:val="20"/>
+        </w:rPr>
+        <w:t>，僅 conciseness 略遜（表一），顯示即使未經微調</w:t>
+      </w:r>
+      <w:r>
+        <w:rPr>
+          <w:rFonts w:eastAsia="標楷體" w:hint="eastAsia"/>
+          <w:sz w:val="20"/>
+        </w:rPr>
+        <w:t xml:space="preserve"/>
+      </w:r>
+      <w:r>
+        <w:rPr>
+          <w:rFonts w:eastAsia="標楷體" w:hint="eastAsia" w:ascii="Times New Roman" w:hAnsi="Times New Roman" w:cs="Times New Roman"/>
+          <w:sz w:val="20"/>
+        </w:rPr>
+        <w:t>、在同等模型容量下，光是把審查流程結構化為多階段本身就能帶來實質之品質效益，可見多階段流程是整合框架中舉足輕重的一環，但如下節所示，它與微調、</w:t>
+      </w:r>
+      <w:r>
+        <w:rPr>
+          <w:rFonts w:eastAsia="標楷體" w:hint="eastAsia" w:ascii="Times New Roman" w:hAnsi="Times New Roman" w:cs="Times New Roman"/>
+          <w:sz w:val="20"/>
+        </w:rPr>
+        <w:t xml:space="preserve">RAG </w:t>
+      </w:r>
+      <w:r>
+        <w:rPr>
+          <w:rFonts w:eastAsia="標楷體" w:hint="eastAsia" w:ascii="Times New Roman" w:hAnsi="Times New Roman" w:cs="Times New Roman"/>
+          <w:sz w:val="20"/>
+        </w:rPr>
+        <w:t>解決的是不同問題而仍需三者協同。</w:t>
+      </w:r>
+    </w:p>
+    <w:p>
+      <w:pPr>
+        <w:spacing w:before="120" w:after="60"/>
+      </w:pPr>
+      <w:r>
+        <w:rPr>
+          <w:rFonts w:eastAsia="標楷體" w:hint="eastAsia" w:ascii="Times New Roman" w:hAnsi="Times New Roman" w:cs="Times New Roman"/>
+          <w:b/>
+          <w:sz w:val="20"/>
+        </w:rPr>
+        <w:t xml:space="preserve">5.4 </w:t>
+      </w:r>
+      <w:r>
+        <w:rPr>
+          <w:rFonts w:eastAsia="標楷體" w:hint="eastAsia" w:ascii="Times New Roman" w:hAnsi="Times New Roman" w:cs="Times New Roman"/>
+          <w:b/>
+          <w:sz w:val="20"/>
+        </w:rPr>
+        <w:t>RQ3：提示詞與微調之邊際貢獻</w:t>
+      </w:r>
+    </w:p>
+    <w:p>
+      <w:pPr>
+        <w:jc w:val="both"/>
+        <w:rPr>
+          <w:rFonts w:eastAsia="標楷體" w:hint="eastAsia"/>
+          <w:sz w:val="20"/>
+        </w:rPr>
+      </w:pPr>
+      <w:r>
+        <w:rPr>
+          <w:rFonts w:eastAsia="標楷體" w:hint="eastAsia" w:ascii="Times New Roman" w:hAnsi="Times New Roman" w:cs="Times New Roman"/>
+          <w:sz w:val="20"/>
+        </w:rPr>
+        <w:t>由表二之消融結果</w:t>
+      </w:r>
+      <w:r>
+        <w:rPr>
+          <w:rFonts w:eastAsia="標楷體" w:hint="eastAsia"/>
+          <w:sz w:val="20"/>
+        </w:rPr>
+        <w:t/>
+      </w:r>
+      <w:r>
+        <w:rPr>
+          <w:rFonts w:eastAsia="標楷體" w:hint="eastAsia"/>
+          <w:sz w:val="20"/>
+        </w:rPr>
+        <w:t xml:space="preserve"/>
+      </w:r>
+      <w:r>
+        <w:rPr>
+          <w:rFonts w:eastAsia="標楷體" w:hint="eastAsia" w:ascii="Times New Roman" w:hAnsi="Times New Roman" w:cs="Times New Roman"/>
+          <w:sz w:val="20"/>
+        </w:rPr>
+        <w:t>可將整合框架之成效分解為各元件之貢獻：自單一</w:t>
       </w:r>
       <w:proofErr w:type="gramStart"/>
       <w:r>
@@ -7897,15 +7939,15 @@
           <w:b/>
           <w:sz w:val="20"/>
         </w:rPr>
-        <w:t xml:space="preserve">5.3 </w:t>
-      </w:r>
-      <w:r>
-        <w:rPr>
-          <w:rFonts w:eastAsia="標楷體" w:hint="eastAsia" w:ascii="Times New Roman" w:hAnsi="Times New Roman" w:cs="Times New Roman"/>
+        <w:t xml:space="preserve">5.5 RQ4：人工評分交叉驗證</w:t>
+      </w:r>
+      <w:r>
+        <w:rPr>
+          <w:rFonts w:eastAsia="標楷體" w:hint="eastAsia"/>
           <w:b/>
           <w:sz w:val="20"/>
         </w:rPr>
-        <w:t>人工評分交叉驗證</w:t>
+        <w:t/>
       </w:r>
     </w:p>
     <w:p>
@@ -7921,42 +7963,42 @@
           <w:rFonts w:eastAsia="標楷體" w:hint="eastAsia" w:ascii="Times New Roman" w:hAnsi="Times New Roman" w:cs="Times New Roman"/>
           <w:sz w:val="20"/>
         </w:rPr>
-        <w:t>RQ4</w:t>
-      </w:r>
-      <w:r>
-        <w:rPr>
-          <w:rFonts w:eastAsia="標楷體" w:hint="eastAsia" w:ascii="Times New Roman" w:hAnsi="Times New Roman" w:cs="Times New Roman"/>
-          <w:sz w:val="20"/>
-        </w:rPr>
-        <w:t>：表三</w:t>
-      </w:r>
-      <w:r>
-        <w:rPr>
-          <w:rFonts w:eastAsia="標楷體" w:hint="eastAsia"/>
-          <w:sz w:val="20"/>
-        </w:rPr>
-        <w:t xml:space="preserve"> </w:t>
-      </w:r>
-      <w:r>
-        <w:rPr>
-          <w:rFonts w:eastAsia="標楷體" w:hint="eastAsia" w:ascii="Times New Roman" w:hAnsi="Times New Roman" w:cs="Times New Roman"/>
-          <w:sz w:val="20"/>
-        </w:rPr>
-        <w:t>之人工評分結果與表二</w:t>
-      </w:r>
-      <w:r>
-        <w:rPr>
-          <w:rFonts w:eastAsia="標楷體" w:hint="eastAsia"/>
-          <w:sz w:val="20"/>
-        </w:rPr>
-        <w:t xml:space="preserve"> </w:t>
-      </w:r>
-      <w:r>
-        <w:rPr>
-          <w:rFonts w:eastAsia="標楷體" w:hint="eastAsia" w:ascii="Times New Roman" w:hAnsi="Times New Roman" w:cs="Times New Roman"/>
-          <w:sz w:val="20"/>
-        </w:rPr>
-        <w:t>之</w:t>
+        <w:t>表三之人工評分結果</w:t>
+      </w:r>
+      <w:r>
+        <w:rPr>
+          <w:rFonts w:eastAsia="標楷體" w:hint="eastAsia" w:ascii="Times New Roman" w:hAnsi="Times New Roman" w:cs="Times New Roman"/>
+          <w:sz w:val="20"/>
+        </w:rPr>
+        <w:t>與表二之</w:t>
+      </w:r>
+      <w:r>
+        <w:rPr>
+          <w:rFonts w:eastAsia="標楷體" w:hint="eastAsia"/>
+          <w:sz w:val="20"/>
+        </w:rPr>
+        <w:t xml:space="preserve"/>
+      </w:r>
+      <w:r>
+        <w:rPr>
+          <w:rFonts w:eastAsia="標楷體" w:hint="eastAsia"/>
+          <w:sz w:val="20"/>
+        </w:rPr>
+        <w:t/>
+      </w:r>
+      <w:r>
+        <w:rPr>
+          <w:rFonts w:eastAsia="標楷體" w:hint="eastAsia"/>
+          <w:sz w:val="20"/>
+        </w:rPr>
+        <w:t xml:space="preserve"/>
+      </w:r>
+      <w:r>
+        <w:rPr>
+          <w:rFonts w:eastAsia="標楷體" w:hint="eastAsia"/>
+          <w:sz w:val="20"/>
+        </w:rPr>
+        <w:t/>
       </w:r>
       <w:r>
         <w:rPr>
@@ -8593,7 +8635,7 @@
           <w:rFonts w:eastAsia="標楷體" w:hint="eastAsia" w:ascii="Times New Roman" w:hAnsi="Times New Roman" w:cs="Times New Roman"/>
           <w:sz w:val="20"/>
         </w:rPr>
-        <w:t>等路徑實際運作，但其可替換之多後端推論的品質、成本與延遲比較仍屬未來工作而未於本文實測，反饋語料累積之效益、以及十七項擴充機制之端到端品質效益，亦均尚未於本文量化評估，留待後續逐項驗證。</w:t>
+        <w:t>等路徑實際運作，但其可替換之多後端推論的品質、成本與延遲比較仍屬未來工作而未於本文實測，反饋語料累積之效益、以及十七項擴充機制之端到端品質效益，亦均尚未於本文量化評估。另，本文之比較以各維度平均分數呈現，未進行統計顯著性檢定，消融亦未單獨分離 RAG 規則注入之貢獻（所有結果皆於檢索層啟用之配置下取得），此等統計穩健性與模組級消融之檢驗，連同上列各項，均留待後續逐項驗證。</w:t>
       </w:r>
     </w:p>
     <w:p>

</xml_diff>